<commit_message>
Fix syntax error in analyze_hop_reduction_merged.py and update pipeline scripts/outputs
</commit_message>
<xml_diff>
--- a/docs/RSLI_DataLineage_and_HopReduction_Solution_Flow.docx
+++ b/docs/RSLI_DataLineage_and_HopReduction_Solution_Flow.docx
@@ -52,6 +52,7 @@
       </w:pPr>
       <w:proofErr w:type="gramStart"/>
       <w:r>
+        <w:lastRenderedPageBreak/>
         <w:t>1  Data</w:t>
       </w:r>
       <w:proofErr w:type="gramEnd"/>
@@ -64,19 +65,7 @@
         <w:spacing w:after="100"/>
       </w:pPr>
       <w:r>
-        <w:t xml:space="preserve">This flow extracts column-level data lineage for </w:t>
-      </w:r>
-      <w:r>
-        <w:t>10</w:t>
-      </w:r>
-      <w:r>
-        <w:t xml:space="preserve"> target RPT</w:t>
-      </w:r>
-      <w:r>
-        <w:t xml:space="preserve"> claims</w:t>
-      </w:r>
-      <w:r>
-        <w:t xml:space="preserve"> tables by tracing TIDAL orchestration jobs through shell scripts into PL/SQL objects. Outputs drive lineage graphs and feed the hop reduction analysis.</w:t>
+        <w:t>This flow extracts column-level data lineage for 33 target RPT tables — the original 14 claims-domain tables plus 19 tables added in the September 2026 cross-domain expansion (agent, billing, commissions, premium, quotes, rate, reserve, sales, suspense, and worksheet reporting) — by tracing TIDAL orchestration jobs through shell scripts, DIFW framework queries, and PL/SQL objects. Outputs drive lineage graphs and feed the hop reduction analysis.</w:t>
       </w:r>
     </w:p>
     <w:p>
@@ -232,31 +221,7 @@
         <w:ind w:left="432"/>
       </w:pPr>
       <w:r>
-        <w:t>① Metadata Sources — Three inputs: TIDAL job dump (TidalDeps_April15.xlsx), shell scripts (.</w:t>
-      </w:r>
-      <w:proofErr w:type="spellStart"/>
-      <w:r>
-        <w:t>sh</w:t>
-      </w:r>
-      <w:proofErr w:type="spellEnd"/>
-      <w:r>
-        <w:t>), and PL/SQL object scripts (</w:t>
-      </w:r>
-      <w:proofErr w:type="spellStart"/>
-      <w:r>
-        <w:t>All_Metadata</w:t>
-      </w:r>
-      <w:proofErr w:type="spellEnd"/>
-      <w:r>
-        <w:t>/*.</w:t>
-      </w:r>
-      <w:proofErr w:type="spellStart"/>
-      <w:r>
-        <w:t>sql</w:t>
-      </w:r>
-      <w:proofErr w:type="spellEnd"/>
-      <w:r>
-        <w:t>).</w:t>
+        <w:t>① Metadata Sources — Four inputs: TIDAL job dump (TIDAL_15_April_updated.xlsx + supplemental TIDAL exports), shell scripts (.sh), PL/SQL object scripts (All_Metadata/*.sql, Lineage_Expansion_Metadata/*.sql), and DIFW query results (DIFW_Query_Results.xlsx — produced by running DIFW_tidal_lineage_query.sql against the DIFW framework's job-log/audit tables, giving pre-resolved ROOT_JOB→DEPENDENT_JOB chains and SRC/TGT column lineage for every DIFW-pattern loader job).</w:t>
       </w:r>
     </w:p>
     <w:p>
@@ -381,6 +346,7 @@
         <w:ind w:left="432"/>
       </w:pPr>
       <w:r>
+        <w:lastRenderedPageBreak/>
         <w:t>procedure call structure (orchestrator vs self-contained vs independent).</w:t>
       </w:r>
     </w:p>
@@ -427,25 +393,7 @@
         <w:ind w:left="432"/>
       </w:pPr>
       <w:r>
-        <w:t>⑦</w:t>
-      </w:r>
-      <w:r>
-        <w:t xml:space="preserve"> Recursive Lineage Builder — Walks the TIDAL dependency chain from each RPT root job, joining shell output + column lineage</w:t>
-      </w:r>
-      <w:r>
-        <w:t xml:space="preserve"> (LLM &amp; Python)</w:t>
-      </w:r>
-      <w:r>
-        <w:t xml:space="preserve"> + TIDAL metadata (depth, runtime)</w:t>
-      </w:r>
-      <w:r>
-        <w:t xml:space="preserve"> + </w:t>
-      </w:r>
-      <w:r>
-        <w:t>+ PKG proc analysis</w:t>
-      </w:r>
-      <w:r>
-        <w:t>.</w:t>
+        <w:t>⑦ Recursive Lineage Builder — Walks the TIDAL dependency chain from each RPT root job, joining DIFW query lineage (DIFW_Query_Results.xlsx) + shell output + column lineage (LLM &amp; Python) + TIDAL metadata (depth, runtime) + PKG proc analysis.</w:t>
       </w:r>
     </w:p>
     <w:p>
@@ -453,23 +401,15 @@
         <w:pStyle w:val="ListBullet"/>
       </w:pPr>
       <w:r>
-        <w:t>⑧</w:t>
-      </w:r>
-      <w:r>
-        <w:t xml:space="preserve"> Outputs — </w:t>
-      </w:r>
-      <w:proofErr w:type="spellStart"/>
-      <w:r>
-        <w:t>tidal_dependency_</w:t>
+        <w:t>⑧ Outputs — tidal_dependency_</w:t>
       </w:r>
       <w:proofErr w:type="gramStart"/>
       <w:r>
         <w:t>graph.json</w:t>
       </w:r>
-      <w:proofErr w:type="spellEnd"/>
       <w:proofErr w:type="gramEnd"/>
       <w:r>
-        <w:t>, combined_lineage_latest.xlsx, and interactive HTML lineage graphs.</w:t>
+        <w:t>, combined_lineage_latest_expanded.xlsx, and interactive HTML lineage graphs.</w:t>
       </w:r>
     </w:p>
     <w:p>
@@ -491,9 +431,9 @@
         <w:tblLook w:val="04A0" w:firstRow="1" w:lastRow="0" w:firstColumn="1" w:lastColumn="0" w:noHBand="0" w:noVBand="1"/>
       </w:tblPr>
       <w:tblGrid>
-        <w:gridCol w:w="3150"/>
-        <w:gridCol w:w="2858"/>
-        <w:gridCol w:w="3568"/>
+        <w:gridCol w:w="3000"/>
+        <w:gridCol w:w="2452"/>
+        <w:gridCol w:w="4124"/>
       </w:tblGrid>
       <w:tr>
         <w:tc>
@@ -541,6 +481,62 @@
                 <w:sz w:val="18"/>
               </w:rPr>
               <w:t>What It Does</w:t>
+            </w:r>
+          </w:p>
+        </w:tc>
+      </w:tr>
+      <w:tr>
+        <w:tc>
+          <w:tcPr>
+            <w:tcW w:w="3150" w:type="dxa"/>
+          </w:tcPr>
+          <w:p>
+            <w:pPr>
+              <w:rPr>
+                <w:sz w:val="17"/>
+              </w:rPr>
+            </w:pPr>
+            <w:r>
+              <w:rPr>
+                <w:sz w:val="17"/>
+              </w:rPr>
+              <w:t>DIFW_tidal_lineage_query.sql</w:t>
+            </w:r>
+          </w:p>
+        </w:tc>
+        <w:tc>
+          <w:tcPr>
+            <w:tcW w:w="2858" w:type="dxa"/>
+          </w:tcPr>
+          <w:p>
+            <w:pPr>
+              <w:rPr>
+                <w:sz w:val="17"/>
+              </w:rPr>
+            </w:pPr>
+            <w:r>
+              <w:rPr>
+                <w:sz w:val="17"/>
+              </w:rPr>
+              <w:t>DIFW Query Run</w:t>
+            </w:r>
+          </w:p>
+        </w:tc>
+        <w:tc>
+          <w:tcPr>
+            <w:tcW w:w="3568" w:type="dxa"/>
+          </w:tcPr>
+          <w:p>
+            <w:pPr>
+              <w:rPr>
+                <w:sz w:val="17"/>
+              </w:rPr>
+            </w:pPr>
+            <w:r>
+              <w:rPr>
+                <w:sz w:val="17"/>
+              </w:rPr>
+              <w:t>Oracle SQL executed against the DIFW framework's job-log/audit tables to produce DIFW_Query_Results.xlsx — pre-resolved ROOT_JOB→DEPENDENT_JOB chains plus SRC_TABLE/TGT_TABLE/SOURCE_COL/TARGET_COL for every DIFW-pattern (PKG_GRP_LOAD_DIFW) loader job. Read first by tidal_shell_combiner.py (--rpt-schema).</w:t>
             </w:r>
           </w:p>
         </w:tc>
@@ -978,10 +974,10 @@
                   <v:path o:extrusionok="f" gradientshapeok="t" o:connecttype="rect"/>
                   <o:lock v:ext="edit" aspectratio="t"/>
                 </v:shapetype>
-                <v:shape id="_x0000_i1025" type="#_x0000_t75" style="width:92.95pt;height:41.55pt" o:ole="">
+                <v:shape id="_x0000_i1025" type="#_x0000_t75" style="width:93pt;height:41.25pt" o:ole="">
                   <v:imagedata r:id="rId7" o:title=""/>
                 </v:shape>
-                <o:OLEObject Type="Embed" ProgID="Package" ShapeID="_x0000_i1025" DrawAspect="Icon" ObjectID="_1846336025" r:id="rId8"/>
+                <o:OLEObject Type="Embed" ProgID="Package" ShapeID="_x0000_i1025" DrawAspect="Icon" ObjectID="_1851228847" r:id="rId8"/>
               </w:object>
             </w:r>
           </w:p>
@@ -1298,6 +1294,1121 @@
     </w:p>
     <w:p>
       <w:pPr>
+        <w:pStyle w:val="Heading2"/>
+      </w:pPr>
+      <w:r>
+        <w:lastRenderedPageBreak/>
+        <w:t>1.4  RPT Table Scope Expansion (September 2026)</w:t>
+      </w:r>
+    </w:p>
+    <w:p>
+      <w:r>
+        <w:t>In September 2026, lineage coverage was expanded beyond the claims domain from 14 to 33 total RPT tables. The 19 newly added tables span agent/commissions, billing, premium, quotes, rate, reserve, sales, suspense, and worksheet reporting. The table below lists the full 33-table scope.</w:t>
+      </w:r>
+    </w:p>
+    <w:tbl>
+      <w:tblPr>
+        <w:tblStyle w:val="TableGrid"/>
+        <w:tblW w:w="0" w:type="auto"/>
+        <w:tblLook w:val="04A0" w:firstRow="1" w:lastRow="0" w:firstColumn="1" w:lastColumn="0" w:noHBand="0" w:noVBand="1"/>
+      </w:tblPr>
+      <w:tblGrid>
+        <w:gridCol w:w="2694"/>
+        <w:gridCol w:w="4100"/>
+        <w:gridCol w:w="2782"/>
+      </w:tblGrid>
+      <w:tr>
+        <w:tc>
+          <w:tcPr>
+            <w:tcW w:w="3120" w:type="dxa"/>
+          </w:tcPr>
+          <w:p>
+            <w:r>
+              <w:t>#</w:t>
+            </w:r>
+          </w:p>
+        </w:tc>
+        <w:tc>
+          <w:tcPr>
+            <w:tcW w:w="3120" w:type="dxa"/>
+          </w:tcPr>
+          <w:p>
+            <w:r>
+              <w:t>RPT Table</w:t>
+            </w:r>
+          </w:p>
+        </w:tc>
+        <w:tc>
+          <w:tcPr>
+            <w:tcW w:w="3120" w:type="dxa"/>
+          </w:tcPr>
+          <w:p>
+            <w:r>
+              <w:t>Scope</w:t>
+            </w:r>
+          </w:p>
+        </w:tc>
+      </w:tr>
+      <w:tr>
+        <w:tc>
+          <w:tcPr>
+            <w:tcW w:w="3120" w:type="dxa"/>
+          </w:tcPr>
+          <w:p>
+            <w:r>
+              <w:t>1</w:t>
+            </w:r>
+          </w:p>
+        </w:tc>
+        <w:tc>
+          <w:tcPr>
+            <w:tcW w:w="3120" w:type="dxa"/>
+          </w:tcPr>
+          <w:p>
+            <w:r>
+              <w:t>RPT_CLAIM_DTL_R</w:t>
+            </w:r>
+          </w:p>
+        </w:tc>
+        <w:tc>
+          <w:tcPr>
+            <w:tcW w:w="3120" w:type="dxa"/>
+          </w:tcPr>
+          <w:p>
+            <w:r>
+              <w:t>Original (Claims)</w:t>
+            </w:r>
+          </w:p>
+        </w:tc>
+      </w:tr>
+      <w:tr>
+        <w:tc>
+          <w:tcPr>
+            <w:tcW w:w="3120" w:type="dxa"/>
+          </w:tcPr>
+          <w:p>
+            <w:r>
+              <w:t>2</w:t>
+            </w:r>
+          </w:p>
+        </w:tc>
+        <w:tc>
+          <w:tcPr>
+            <w:tcW w:w="3120" w:type="dxa"/>
+          </w:tcPr>
+          <w:p>
+            <w:r>
+              <w:t>RPT_CLAIM_NOTE_R</w:t>
+            </w:r>
+          </w:p>
+        </w:tc>
+        <w:tc>
+          <w:tcPr>
+            <w:tcW w:w="3120" w:type="dxa"/>
+          </w:tcPr>
+          <w:p>
+            <w:r>
+              <w:t>Original (Claims)</w:t>
+            </w:r>
+          </w:p>
+        </w:tc>
+      </w:tr>
+      <w:tr>
+        <w:tc>
+          <w:tcPr>
+            <w:tcW w:w="3120" w:type="dxa"/>
+          </w:tcPr>
+          <w:p>
+            <w:r>
+              <w:t>3</w:t>
+            </w:r>
+          </w:p>
+        </w:tc>
+        <w:tc>
+          <w:tcPr>
+            <w:tcW w:w="3120" w:type="dxa"/>
+          </w:tcPr>
+          <w:p>
+            <w:r>
+              <w:t>RPT_CLAIM_PAYMENT_DTL_R</w:t>
+            </w:r>
+          </w:p>
+        </w:tc>
+        <w:tc>
+          <w:tcPr>
+            <w:tcW w:w="3120" w:type="dxa"/>
+          </w:tcPr>
+          <w:p>
+            <w:r>
+              <w:t>Original (Claims)</w:t>
+            </w:r>
+          </w:p>
+        </w:tc>
+      </w:tr>
+      <w:tr>
+        <w:tc>
+          <w:tcPr>
+            <w:tcW w:w="3120" w:type="dxa"/>
+          </w:tcPr>
+          <w:p>
+            <w:r>
+              <w:t>4</w:t>
+            </w:r>
+          </w:p>
+        </w:tc>
+        <w:tc>
+          <w:tcPr>
+            <w:tcW w:w="3120" w:type="dxa"/>
+          </w:tcPr>
+          <w:p>
+            <w:r>
+              <w:t>RPT_CLAIM_PAYMENT_R</w:t>
+            </w:r>
+          </w:p>
+        </w:tc>
+        <w:tc>
+          <w:tcPr>
+            <w:tcW w:w="3120" w:type="dxa"/>
+          </w:tcPr>
+          <w:p>
+            <w:r>
+              <w:t>Original (Claims)</w:t>
+            </w:r>
+          </w:p>
+        </w:tc>
+      </w:tr>
+      <w:tr>
+        <w:tc>
+          <w:tcPr>
+            <w:tcW w:w="3120" w:type="dxa"/>
+          </w:tcPr>
+          <w:p>
+            <w:r>
+              <w:t>5</w:t>
+            </w:r>
+          </w:p>
+        </w:tc>
+        <w:tc>
+          <w:tcPr>
+            <w:tcW w:w="3120" w:type="dxa"/>
+          </w:tcPr>
+          <w:p>
+            <w:r>
+              <w:t>RPT_CLAIM_SUM_R</w:t>
+            </w:r>
+          </w:p>
+        </w:tc>
+        <w:tc>
+          <w:tcPr>
+            <w:tcW w:w="3120" w:type="dxa"/>
+          </w:tcPr>
+          <w:p>
+            <w:r>
+              <w:t>Original (Claims)</w:t>
+            </w:r>
+          </w:p>
+        </w:tc>
+      </w:tr>
+      <w:tr>
+        <w:tc>
+          <w:tcPr>
+            <w:tcW w:w="3120" w:type="dxa"/>
+          </w:tcPr>
+          <w:p>
+            <w:r>
+              <w:t>6</w:t>
+            </w:r>
+          </w:p>
+        </w:tc>
+        <w:tc>
+          <w:tcPr>
+            <w:tcW w:w="3120" w:type="dxa"/>
+          </w:tcPr>
+          <w:p>
+            <w:r>
+              <w:t>RPT_CLAIM_TASK_R</w:t>
+            </w:r>
+          </w:p>
+        </w:tc>
+        <w:tc>
+          <w:tcPr>
+            <w:tcW w:w="3120" w:type="dxa"/>
+          </w:tcPr>
+          <w:p>
+            <w:r>
+              <w:t>Original (Claims)</w:t>
+            </w:r>
+          </w:p>
+        </w:tc>
+      </w:tr>
+      <w:tr>
+        <w:tc>
+          <w:tcPr>
+            <w:tcW w:w="3120" w:type="dxa"/>
+          </w:tcPr>
+          <w:p>
+            <w:r>
+              <w:t>7</w:t>
+            </w:r>
+          </w:p>
+        </w:tc>
+        <w:tc>
+          <w:tcPr>
+            <w:tcW w:w="3120" w:type="dxa"/>
+          </w:tcPr>
+          <w:p>
+            <w:r>
+              <w:t>RPT_CLAIMANT_DTL_R</w:t>
+            </w:r>
+          </w:p>
+        </w:tc>
+        <w:tc>
+          <w:tcPr>
+            <w:tcW w:w="3120" w:type="dxa"/>
+          </w:tcPr>
+          <w:p>
+            <w:r>
+              <w:t>Original (Claims)</w:t>
+            </w:r>
+          </w:p>
+        </w:tc>
+      </w:tr>
+      <w:tr>
+        <w:tc>
+          <w:tcPr>
+            <w:tcW w:w="3120" w:type="dxa"/>
+          </w:tcPr>
+          <w:p>
+            <w:r>
+              <w:t>8</w:t>
+            </w:r>
+          </w:p>
+        </w:tc>
+        <w:tc>
+          <w:tcPr>
+            <w:tcW w:w="3120" w:type="dxa"/>
+          </w:tcPr>
+          <w:p>
+            <w:r>
+              <w:t>RPT_FCT_RPT_CLAIM_SUMMARY_R</w:t>
+            </w:r>
+          </w:p>
+        </w:tc>
+        <w:tc>
+          <w:tcPr>
+            <w:tcW w:w="3120" w:type="dxa"/>
+          </w:tcPr>
+          <w:p>
+            <w:r>
+              <w:t>Original (Claims)</w:t>
+            </w:r>
+          </w:p>
+        </w:tc>
+      </w:tr>
+      <w:tr>
+        <w:tc>
+          <w:tcPr>
+            <w:tcW w:w="3120" w:type="dxa"/>
+          </w:tcPr>
+          <w:p>
+            <w:r>
+              <w:t>9</w:t>
+            </w:r>
+          </w:p>
+        </w:tc>
+        <w:tc>
+          <w:tcPr>
+            <w:tcW w:w="3120" w:type="dxa"/>
+          </w:tcPr>
+          <w:p>
+            <w:r>
+              <w:t>RPT_DICS_CLAIMS_DETAIL_OAC_R</w:t>
+            </w:r>
+          </w:p>
+        </w:tc>
+        <w:tc>
+          <w:tcPr>
+            <w:tcW w:w="3120" w:type="dxa"/>
+          </w:tcPr>
+          <w:p>
+            <w:r>
+              <w:t>Original (Claims)</w:t>
+            </w:r>
+          </w:p>
+        </w:tc>
+      </w:tr>
+      <w:tr>
+        <w:tc>
+          <w:tcPr>
+            <w:tcW w:w="3120" w:type="dxa"/>
+          </w:tcPr>
+          <w:p>
+            <w:r>
+              <w:t>10</w:t>
+            </w:r>
+          </w:p>
+        </w:tc>
+        <w:tc>
+          <w:tcPr>
+            <w:tcW w:w="3120" w:type="dxa"/>
+          </w:tcPr>
+          <w:p>
+            <w:r>
+              <w:t>RPT_FCT_RPT_CLAIM_SUMMARY_R_HIST</w:t>
+            </w:r>
+          </w:p>
+        </w:tc>
+        <w:tc>
+          <w:tcPr>
+            <w:tcW w:w="3120" w:type="dxa"/>
+          </w:tcPr>
+          <w:p>
+            <w:r>
+              <w:t>Original (Claims)</w:t>
+            </w:r>
+          </w:p>
+        </w:tc>
+      </w:tr>
+      <w:tr>
+        <w:tc>
+          <w:tcPr>
+            <w:tcW w:w="3120" w:type="dxa"/>
+          </w:tcPr>
+          <w:p>
+            <w:r>
+              <w:t>11</w:t>
+            </w:r>
+          </w:p>
+        </w:tc>
+        <w:tc>
+          <w:tcPr>
+            <w:tcW w:w="3120" w:type="dxa"/>
+          </w:tcPr>
+          <w:p>
+            <w:r>
+              <w:t>RPT_CLIENT_DTL_R</w:t>
+            </w:r>
+          </w:p>
+        </w:tc>
+        <w:tc>
+          <w:tcPr>
+            <w:tcW w:w="3120" w:type="dxa"/>
+          </w:tcPr>
+          <w:p>
+            <w:r>
+              <w:t>Original (Claims)</w:t>
+            </w:r>
+          </w:p>
+        </w:tc>
+      </w:tr>
+      <w:tr>
+        <w:tc>
+          <w:tcPr>
+            <w:tcW w:w="3120" w:type="dxa"/>
+          </w:tcPr>
+          <w:p>
+            <w:r>
+              <w:t>12</w:t>
+            </w:r>
+          </w:p>
+        </w:tc>
+        <w:tc>
+          <w:tcPr>
+            <w:tcW w:w="3120" w:type="dxa"/>
+          </w:tcPr>
+          <w:p>
+            <w:r>
+              <w:t>RPT_GRP_PRODUCT_R</w:t>
+            </w:r>
+          </w:p>
+        </w:tc>
+        <w:tc>
+          <w:tcPr>
+            <w:tcW w:w="3120" w:type="dxa"/>
+          </w:tcPr>
+          <w:p>
+            <w:r>
+              <w:t>Original (Claims)</w:t>
+            </w:r>
+          </w:p>
+        </w:tc>
+      </w:tr>
+      <w:tr>
+        <w:tc>
+          <w:tcPr>
+            <w:tcW w:w="3120" w:type="dxa"/>
+          </w:tcPr>
+          <w:p>
+            <w:r>
+              <w:t>13</w:t>
+            </w:r>
+          </w:p>
+        </w:tc>
+        <w:tc>
+          <w:tcPr>
+            <w:tcW w:w="3120" w:type="dxa"/>
+          </w:tcPr>
+          <w:p>
+            <w:r>
+              <w:t>RPT_EMPLOYEE_R</w:t>
+            </w:r>
+          </w:p>
+        </w:tc>
+        <w:tc>
+          <w:tcPr>
+            <w:tcW w:w="3120" w:type="dxa"/>
+          </w:tcPr>
+          <w:p>
+            <w:r>
+              <w:t>Original (Claims)</w:t>
+            </w:r>
+          </w:p>
+        </w:tc>
+      </w:tr>
+      <w:tr>
+        <w:tc>
+          <w:tcPr>
+            <w:tcW w:w="3120" w:type="dxa"/>
+          </w:tcPr>
+          <w:p>
+            <w:r>
+              <w:t>14</w:t>
+            </w:r>
+          </w:p>
+        </w:tc>
+        <w:tc>
+          <w:tcPr>
+            <w:tcW w:w="3120" w:type="dxa"/>
+          </w:tcPr>
+          <w:p>
+            <w:r>
+              <w:t>RPT_POLICY_DTL_R</w:t>
+            </w:r>
+          </w:p>
+        </w:tc>
+        <w:tc>
+          <w:tcPr>
+            <w:tcW w:w="3120" w:type="dxa"/>
+          </w:tcPr>
+          <w:p>
+            <w:r>
+              <w:t>Original (Claims)</w:t>
+            </w:r>
+          </w:p>
+        </w:tc>
+      </w:tr>
+      <w:tr>
+        <w:tc>
+          <w:tcPr>
+            <w:tcW w:w="3120" w:type="dxa"/>
+          </w:tcPr>
+          <w:p>
+            <w:r>
+              <w:t>15</w:t>
+            </w:r>
+          </w:p>
+        </w:tc>
+        <w:tc>
+          <w:tcPr>
+            <w:tcW w:w="3120" w:type="dxa"/>
+          </w:tcPr>
+          <w:p>
+            <w:r>
+              <w:t>RPT_AGENT_POLICY_R</w:t>
+            </w:r>
+          </w:p>
+        </w:tc>
+        <w:tc>
+          <w:tcPr>
+            <w:tcW w:w="3120" w:type="dxa"/>
+          </w:tcPr>
+          <w:p>
+            <w:r>
+              <w:t>New (Sept 2026)</w:t>
+            </w:r>
+          </w:p>
+        </w:tc>
+      </w:tr>
+      <w:tr>
+        <w:tc>
+          <w:tcPr>
+            <w:tcW w:w="3120" w:type="dxa"/>
+          </w:tcPr>
+          <w:p>
+            <w:r>
+              <w:t>16</w:t>
+            </w:r>
+          </w:p>
+        </w:tc>
+        <w:tc>
+          <w:tcPr>
+            <w:tcW w:w="3120" w:type="dxa"/>
+          </w:tcPr>
+          <w:p>
+            <w:r>
+              <w:t>RPT_AGENT_R</w:t>
+            </w:r>
+          </w:p>
+        </w:tc>
+        <w:tc>
+          <w:tcPr>
+            <w:tcW w:w="3120" w:type="dxa"/>
+          </w:tcPr>
+          <w:p>
+            <w:r>
+              <w:t>New (Sept 2026)</w:t>
+            </w:r>
+          </w:p>
+        </w:tc>
+      </w:tr>
+      <w:tr>
+        <w:tc>
+          <w:tcPr>
+            <w:tcW w:w="3120" w:type="dxa"/>
+          </w:tcPr>
+          <w:p>
+            <w:r>
+              <w:t>17</w:t>
+            </w:r>
+          </w:p>
+        </w:tc>
+        <w:tc>
+          <w:tcPr>
+            <w:tcW w:w="3120" w:type="dxa"/>
+          </w:tcPr>
+          <w:p>
+            <w:r>
+              <w:t>RPT_BILLGROUP_R</w:t>
+            </w:r>
+          </w:p>
+        </w:tc>
+        <w:tc>
+          <w:tcPr>
+            <w:tcW w:w="3120" w:type="dxa"/>
+          </w:tcPr>
+          <w:p>
+            <w:r>
+              <w:t>New (Sept 2026)</w:t>
+            </w:r>
+          </w:p>
+        </w:tc>
+      </w:tr>
+      <w:tr>
+        <w:tc>
+          <w:tcPr>
+            <w:tcW w:w="3120" w:type="dxa"/>
+          </w:tcPr>
+          <w:p>
+            <w:r>
+              <w:t>18</w:t>
+            </w:r>
+          </w:p>
+        </w:tc>
+        <w:tc>
+          <w:tcPr>
+            <w:tcW w:w="3120" w:type="dxa"/>
+          </w:tcPr>
+          <w:p>
+            <w:r>
+              <w:t>RPT_COMMISSIONS_R</w:t>
+            </w:r>
+          </w:p>
+        </w:tc>
+        <w:tc>
+          <w:tcPr>
+            <w:tcW w:w="3120" w:type="dxa"/>
+          </w:tcPr>
+          <w:p>
+            <w:r>
+              <w:t>New (Sept 2026)</w:t>
+            </w:r>
+          </w:p>
+        </w:tc>
+      </w:tr>
+      <w:tr>
+        <w:tc>
+          <w:tcPr>
+            <w:tcW w:w="3120" w:type="dxa"/>
+          </w:tcPr>
+          <w:p>
+            <w:r>
+              <w:t>19</w:t>
+            </w:r>
+          </w:p>
+        </w:tc>
+        <w:tc>
+          <w:tcPr>
+            <w:tcW w:w="3120" w:type="dxa"/>
+          </w:tcPr>
+          <w:p>
+            <w:r>
+              <w:t>RPT_EOI_APPLICANT_R</w:t>
+            </w:r>
+          </w:p>
+        </w:tc>
+        <w:tc>
+          <w:tcPr>
+            <w:tcW w:w="3120" w:type="dxa"/>
+          </w:tcPr>
+          <w:p>
+            <w:r>
+              <w:t>New (Sept 2026)</w:t>
+            </w:r>
+          </w:p>
+        </w:tc>
+      </w:tr>
+      <w:tr>
+        <w:tc>
+          <w:tcPr>
+            <w:tcW w:w="3120" w:type="dxa"/>
+          </w:tcPr>
+          <w:p>
+            <w:r>
+              <w:t>20</w:t>
+            </w:r>
+          </w:p>
+        </w:tc>
+        <w:tc>
+          <w:tcPr>
+            <w:tcW w:w="3120" w:type="dxa"/>
+          </w:tcPr>
+          <w:p>
+            <w:r>
+              <w:t>RPT_FCT_INCURRED_SUMMARY_R</w:t>
+            </w:r>
+          </w:p>
+        </w:tc>
+        <w:tc>
+          <w:tcPr>
+            <w:tcW w:w="3120" w:type="dxa"/>
+          </w:tcPr>
+          <w:p>
+            <w:r>
+              <w:t>New (Sept 2026)</w:t>
+            </w:r>
+          </w:p>
+        </w:tc>
+      </w:tr>
+      <w:tr>
+        <w:tc>
+          <w:tcPr>
+            <w:tcW w:w="3120" w:type="dxa"/>
+          </w:tcPr>
+          <w:p>
+            <w:r>
+              <w:t>21</w:t>
+            </w:r>
+          </w:p>
+        </w:tc>
+        <w:tc>
+          <w:tcPr>
+            <w:tcW w:w="3120" w:type="dxa"/>
+          </w:tcPr>
+          <w:p>
+            <w:r>
+              <w:t>RPT_FCT_RPT_ANN_PREM_SUMMARY_R</w:t>
+            </w:r>
+          </w:p>
+        </w:tc>
+        <w:tc>
+          <w:tcPr>
+            <w:tcW w:w="3120" w:type="dxa"/>
+          </w:tcPr>
+          <w:p>
+            <w:r>
+              <w:t>New (Sept 2026)</w:t>
+            </w:r>
+          </w:p>
+        </w:tc>
+      </w:tr>
+      <w:tr>
+        <w:tc>
+          <w:tcPr>
+            <w:tcW w:w="3120" w:type="dxa"/>
+          </w:tcPr>
+          <w:p>
+            <w:r>
+              <w:t>22</w:t>
+            </w:r>
+          </w:p>
+        </w:tc>
+        <w:tc>
+          <w:tcPr>
+            <w:tcW w:w="3120" w:type="dxa"/>
+          </w:tcPr>
+          <w:p>
+            <w:r>
+              <w:t>RPT_FCT_RPT_PREMIUM_SUMMARY_R</w:t>
+            </w:r>
+          </w:p>
+        </w:tc>
+        <w:tc>
+          <w:tcPr>
+            <w:tcW w:w="3120" w:type="dxa"/>
+          </w:tcPr>
+          <w:p>
+            <w:r>
+              <w:t>New (Sept 2026)</w:t>
+            </w:r>
+          </w:p>
+        </w:tc>
+      </w:tr>
+      <w:tr>
+        <w:tc>
+          <w:tcPr>
+            <w:tcW w:w="3120" w:type="dxa"/>
+          </w:tcPr>
+          <w:p>
+            <w:r>
+              <w:t>23</w:t>
+            </w:r>
+          </w:p>
+        </w:tc>
+        <w:tc>
+          <w:tcPr>
+            <w:tcW w:w="3120" w:type="dxa"/>
+          </w:tcPr>
+          <w:p>
+            <w:r>
+              <w:t>RPT_PAYEE_DTL_R</w:t>
+            </w:r>
+          </w:p>
+        </w:tc>
+        <w:tc>
+          <w:tcPr>
+            <w:tcW w:w="3120" w:type="dxa"/>
+          </w:tcPr>
+          <w:p>
+            <w:r>
+              <w:t>New (Sept 2026)</w:t>
+            </w:r>
+          </w:p>
+        </w:tc>
+      </w:tr>
+      <w:tr>
+        <w:tc>
+          <w:tcPr>
+            <w:tcW w:w="3120" w:type="dxa"/>
+          </w:tcPr>
+          <w:p>
+            <w:r>
+              <w:t>24</w:t>
+            </w:r>
+          </w:p>
+        </w:tc>
+        <w:tc>
+          <w:tcPr>
+            <w:tcW w:w="3120" w:type="dxa"/>
+          </w:tcPr>
+          <w:p>
+            <w:r>
+              <w:t>RPT_POSTED_SUSPENSE_R</w:t>
+            </w:r>
+          </w:p>
+        </w:tc>
+        <w:tc>
+          <w:tcPr>
+            <w:tcW w:w="3120" w:type="dxa"/>
+          </w:tcPr>
+          <w:p>
+            <w:r>
+              <w:t>New (Sept 2026)</w:t>
+            </w:r>
+          </w:p>
+        </w:tc>
+      </w:tr>
+      <w:tr>
+        <w:tc>
+          <w:tcPr>
+            <w:tcW w:w="3120" w:type="dxa"/>
+          </w:tcPr>
+          <w:p>
+            <w:r>
+              <w:t>25</w:t>
+            </w:r>
+          </w:p>
+        </w:tc>
+        <w:tc>
+          <w:tcPr>
+            <w:tcW w:w="3120" w:type="dxa"/>
+          </w:tcPr>
+          <w:p>
+            <w:r>
+              <w:t>RPT_PREMIUM_DTL_R</w:t>
+            </w:r>
+          </w:p>
+        </w:tc>
+        <w:tc>
+          <w:tcPr>
+            <w:tcW w:w="3120" w:type="dxa"/>
+          </w:tcPr>
+          <w:p>
+            <w:r>
+              <w:t>New (Sept 2026)</w:t>
+            </w:r>
+          </w:p>
+        </w:tc>
+      </w:tr>
+      <w:tr>
+        <w:tc>
+          <w:tcPr>
+            <w:tcW w:w="3120" w:type="dxa"/>
+          </w:tcPr>
+          <w:p>
+            <w:r>
+              <w:t>26</w:t>
+            </w:r>
+          </w:p>
+        </w:tc>
+        <w:tc>
+          <w:tcPr>
+            <w:tcW w:w="3120" w:type="dxa"/>
+          </w:tcPr>
+          <w:p>
+            <w:r>
+              <w:t>RPT_PREMIUM_R</w:t>
+            </w:r>
+          </w:p>
+        </w:tc>
+        <w:tc>
+          <w:tcPr>
+            <w:tcW w:w="3120" w:type="dxa"/>
+          </w:tcPr>
+          <w:p>
+            <w:r>
+              <w:t>New (Sept 2026)</w:t>
+            </w:r>
+          </w:p>
+        </w:tc>
+      </w:tr>
+      <w:tr>
+        <w:tc>
+          <w:tcPr>
+            <w:tcW w:w="3120" w:type="dxa"/>
+          </w:tcPr>
+          <w:p>
+            <w:r>
+              <w:t>27</w:t>
+            </w:r>
+          </w:p>
+        </w:tc>
+        <w:tc>
+          <w:tcPr>
+            <w:tcW w:w="3120" w:type="dxa"/>
+          </w:tcPr>
+          <w:p>
+            <w:r>
+              <w:t>RPT_QUOTES_DTL_R</w:t>
+            </w:r>
+          </w:p>
+        </w:tc>
+        <w:tc>
+          <w:tcPr>
+            <w:tcW w:w="3120" w:type="dxa"/>
+          </w:tcPr>
+          <w:p>
+            <w:r>
+              <w:t>New (Sept 2026)</w:t>
+            </w:r>
+          </w:p>
+        </w:tc>
+      </w:tr>
+      <w:tr>
+        <w:tc>
+          <w:tcPr>
+            <w:tcW w:w="3120" w:type="dxa"/>
+          </w:tcPr>
+          <w:p>
+            <w:r>
+              <w:t>28</w:t>
+            </w:r>
+          </w:p>
+        </w:tc>
+        <w:tc>
+          <w:tcPr>
+            <w:tcW w:w="3120" w:type="dxa"/>
+          </w:tcPr>
+          <w:p>
+            <w:r>
+              <w:t>RPT_QUOTES_R</w:t>
+            </w:r>
+          </w:p>
+        </w:tc>
+        <w:tc>
+          <w:tcPr>
+            <w:tcW w:w="3120" w:type="dxa"/>
+          </w:tcPr>
+          <w:p>
+            <w:r>
+              <w:t>New (Sept 2026)</w:t>
+            </w:r>
+          </w:p>
+        </w:tc>
+      </w:tr>
+      <w:tr>
+        <w:tc>
+          <w:tcPr>
+            <w:tcW w:w="3120" w:type="dxa"/>
+          </w:tcPr>
+          <w:p>
+            <w:r>
+              <w:t>29</w:t>
+            </w:r>
+          </w:p>
+        </w:tc>
+        <w:tc>
+          <w:tcPr>
+            <w:tcW w:w="3120" w:type="dxa"/>
+          </w:tcPr>
+          <w:p>
+            <w:r>
+              <w:t>RPT_RATE_R</w:t>
+            </w:r>
+          </w:p>
+        </w:tc>
+        <w:tc>
+          <w:tcPr>
+            <w:tcW w:w="3120" w:type="dxa"/>
+          </w:tcPr>
+          <w:p>
+            <w:r>
+              <w:t>New (Sept 2026)</w:t>
+            </w:r>
+          </w:p>
+        </w:tc>
+      </w:tr>
+      <w:tr>
+        <w:tc>
+          <w:tcPr>
+            <w:tcW w:w="3120" w:type="dxa"/>
+          </w:tcPr>
+          <w:p>
+            <w:r>
+              <w:t>30</w:t>
+            </w:r>
+          </w:p>
+        </w:tc>
+        <w:tc>
+          <w:tcPr>
+            <w:tcW w:w="3120" w:type="dxa"/>
+          </w:tcPr>
+          <w:p>
+            <w:r>
+              <w:t>RPT_RESERVE_DETAILS_R</w:t>
+            </w:r>
+          </w:p>
+        </w:tc>
+        <w:tc>
+          <w:tcPr>
+            <w:tcW w:w="3120" w:type="dxa"/>
+          </w:tcPr>
+          <w:p>
+            <w:r>
+              <w:t>New (Sept 2026)</w:t>
+            </w:r>
+          </w:p>
+        </w:tc>
+      </w:tr>
+      <w:tr>
+        <w:tc>
+          <w:tcPr>
+            <w:tcW w:w="3120" w:type="dxa"/>
+          </w:tcPr>
+          <w:p>
+            <w:r>
+              <w:t>31</w:t>
+            </w:r>
+          </w:p>
+        </w:tc>
+        <w:tc>
+          <w:tcPr>
+            <w:tcW w:w="3120" w:type="dxa"/>
+          </w:tcPr>
+          <w:p>
+            <w:r>
+              <w:t>RPT_SALES_REP_R</w:t>
+            </w:r>
+          </w:p>
+        </w:tc>
+        <w:tc>
+          <w:tcPr>
+            <w:tcW w:w="3120" w:type="dxa"/>
+          </w:tcPr>
+          <w:p>
+            <w:r>
+              <w:t>New (Sept 2026)</w:t>
+            </w:r>
+          </w:p>
+        </w:tc>
+      </w:tr>
+      <w:tr>
+        <w:tc>
+          <w:tcPr>
+            <w:tcW w:w="3120" w:type="dxa"/>
+          </w:tcPr>
+          <w:p>
+            <w:r>
+              <w:t>32</w:t>
+            </w:r>
+          </w:p>
+        </w:tc>
+        <w:tc>
+          <w:tcPr>
+            <w:tcW w:w="3120" w:type="dxa"/>
+          </w:tcPr>
+          <w:p>
+            <w:r>
+              <w:t>RPT_SUSPENSE_DTL_R</w:t>
+            </w:r>
+          </w:p>
+        </w:tc>
+        <w:tc>
+          <w:tcPr>
+            <w:tcW w:w="3120" w:type="dxa"/>
+          </w:tcPr>
+          <w:p>
+            <w:r>
+              <w:t>New (Sept 2026)</w:t>
+            </w:r>
+          </w:p>
+        </w:tc>
+      </w:tr>
+      <w:tr>
+        <w:tc>
+          <w:tcPr>
+            <w:tcW w:w="3120" w:type="dxa"/>
+          </w:tcPr>
+          <w:p>
+            <w:r>
+              <w:t>33</w:t>
+            </w:r>
+          </w:p>
+        </w:tc>
+        <w:tc>
+          <w:tcPr>
+            <w:tcW w:w="3120" w:type="dxa"/>
+          </w:tcPr>
+          <w:p>
+            <w:r>
+              <w:t>RPT_WORKSHEET_DTL_R</w:t>
+            </w:r>
+          </w:p>
+        </w:tc>
+        <w:tc>
+          <w:tcPr>
+            <w:tcW w:w="3120" w:type="dxa"/>
+          </w:tcPr>
+          <w:p>
+            <w:r>
+              <w:t>New (Sept 2026)</w:t>
+            </w:r>
+          </w:p>
+        </w:tc>
+      </w:tr>
+    </w:tbl>
+    <w:p/>
+    <w:p>
+      <w:pPr>
         <w:pStyle w:val="Heading1"/>
         <w:spacing w:before="280" w:after="80"/>
       </w:pPr>
@@ -1333,6 +2444,7 @@
       </w:pPr>
       <w:proofErr w:type="gramStart"/>
       <w:r>
+        <w:lastRenderedPageBreak/>
         <w:t>2.1  Flow</w:t>
       </w:r>
       <w:proofErr w:type="gramEnd"/>
@@ -1456,6 +2568,7 @@
       </w:pPr>
       <w:proofErr w:type="gramStart"/>
       <w:r>
+        <w:lastRenderedPageBreak/>
         <w:t>2.2  Flow</w:t>
       </w:r>
       <w:proofErr w:type="gramEnd"/>
@@ -1746,10 +2859,10 @@
                 <w:szCs w:val="17"/>
               </w:rPr>
               <w:object w:dxaOrig="2310" w:dyaOrig="830" w14:anchorId="56821B3F">
-                <v:shape id="_x0000_i1026" type="#_x0000_t75" style="width:81.9pt;height:37.6pt" o:ole="">
+                <v:shape id="_x0000_i1026" type="#_x0000_t75" style="width:81.75pt;height:37.5pt" o:ole="">
                   <v:imagedata r:id="rId10" o:title=""/>
                 </v:shape>
-                <o:OLEObject Type="Embed" ProgID="Package" ShapeID="_x0000_i1026" DrawAspect="Content" ObjectID="_1846336026" r:id="rId11"/>
+                <o:OLEObject Type="Embed" ProgID="Package" ShapeID="_x0000_i1026" DrawAspect="Content" ObjectID="_1851228848" r:id="rId11"/>
               </w:object>
             </w:r>
           </w:p>
@@ -2243,7 +3356,14 @@
               <w:rPr>
                 <w:sz w:val="17"/>
               </w:rPr>
-              <w:t xml:space="preserve">Sequential chains of jobs with no column-level data dependency — safe to </w:t>
+              <w:t xml:space="preserve">Sequential chains of jobs with no column-level </w:t>
+            </w:r>
+            <w:r>
+              <w:rPr>
+                <w:sz w:val="17"/>
+              </w:rPr>
+              <w:lastRenderedPageBreak/>
+              <w:t xml:space="preserve">data dependency — safe to </w:t>
             </w:r>
             <w:proofErr w:type="spellStart"/>
             <w:r>
@@ -2273,6 +3393,7 @@
                 <w:color w:val="375123"/>
                 <w:sz w:val="17"/>
               </w:rPr>
+              <w:lastRenderedPageBreak/>
               <w:t>LOW</w:t>
             </w:r>
           </w:p>
@@ -2981,6 +4102,7 @@
       </w:pPr>
       <w:proofErr w:type="gramStart"/>
       <w:r>
+        <w:lastRenderedPageBreak/>
         <w:t>3  How</w:t>
       </w:r>
       <w:proofErr w:type="gramEnd"/>
@@ -3037,7 +4159,7 @@
         <w:ind w:left="432"/>
       </w:pPr>
       <w:r>
-        <w:t>combined_lineage_latest.xlsx — provides column-level evidence (SRC_TABLE, TGT_TABLE, SOURCE_COL, TARGET_COL, FULL_OBJECT, IS_PARAMETERIZED) that detectors use to classify and score each pattern.</w:t>
+        <w:t>combined_lineage_latest_expanded.xlsx — provides column-level evidence (SRC_TABLE, TGT_TABLE, SOURCE_COL, TARGET_COL, FULL_OBJECT, IS_PARAMETERIZED) that detectors use to classify and score each pattern.</w:t>
       </w:r>
     </w:p>
     <w:p>
@@ -3403,16 +4525,472 @@
         <w:ind w:left="360" w:hanging="360"/>
       </w:pPr>
     </w:p>
+    <w:p/>
     <w:p>
       <w:pPr>
         <w:pStyle w:val="Heading1"/>
-        <w:spacing w:before="280" w:after="80"/>
       </w:pPr>
+      <w:proofErr w:type="gramStart"/>
+      <w:r>
+        <w:lastRenderedPageBreak/>
+        <w:t>4  Pipeline</w:t>
+      </w:r>
+      <w:proofErr w:type="gramEnd"/>
+      <w:r>
+        <w:t xml:space="preserve"> Rerun Strategy (Ongoing Maintenance)</w:t>
+      </w:r>
+    </w:p>
+    <w:p>
+      <w:r>
+        <w:t>The environment is under active development — TIDAL job dependencies, shell scripts, and PL/SQL packages/procedures change independently of the lineage pipeline. Without a rerun strategy, combined_lineage_latest_expanded.csv silently drifts out of date. run_pipeline.py (10 stages, see script docstring) orchestrates every stage below; use --stages / --from-stage to run a subset.</w:t>
+      </w:r>
     </w:p>
     <w:p>
       <w:pPr>
-        <w:spacing w:after="100"/>
+        <w:pStyle w:val="Heading2"/>
       </w:pPr>
+      <w:r>
+        <w:t>4.1  Trigger-Based Rerun Matrix</w:t>
+      </w:r>
+    </w:p>
+    <w:tbl>
+      <w:tblPr>
+        <w:tblStyle w:val="TableGrid"/>
+        <w:tblW w:w="0" w:type="auto"/>
+        <w:tblLook w:val="04A0" w:firstRow="1" w:lastRow="0" w:firstColumn="1" w:lastColumn="0" w:noHBand="0" w:noVBand="1"/>
+      </w:tblPr>
+      <w:tblGrid>
+        <w:gridCol w:w="2759"/>
+        <w:gridCol w:w="2196"/>
+        <w:gridCol w:w="2352"/>
+        <w:gridCol w:w="2269"/>
+      </w:tblGrid>
+      <w:tr>
+        <w:tc>
+          <w:tcPr>
+            <w:tcW w:w="2340" w:type="dxa"/>
+          </w:tcPr>
+          <w:p>
+            <w:r>
+              <w:t>Trigger Event</w:t>
+            </w:r>
+          </w:p>
+        </w:tc>
+        <w:tc>
+          <w:tcPr>
+            <w:tcW w:w="2340" w:type="dxa"/>
+          </w:tcPr>
+          <w:p>
+            <w:r>
+              <w:t>Stages to Rerun</w:t>
+            </w:r>
+          </w:p>
+        </w:tc>
+        <w:tc>
+          <w:tcPr>
+            <w:tcW w:w="2340" w:type="dxa"/>
+          </w:tcPr>
+          <w:p>
+            <w:r>
+              <w:t>Cadence</w:t>
+            </w:r>
+          </w:p>
+        </w:tc>
+        <w:tc>
+          <w:tcPr>
+            <w:tcW w:w="2340" w:type="dxa"/>
+          </w:tcPr>
+          <w:p>
+            <w:r>
+              <w:t>Notes</w:t>
+            </w:r>
+          </w:p>
+        </w:tc>
+      </w:tr>
+      <w:tr>
+        <w:tc>
+          <w:tcPr>
+            <w:tcW w:w="2340" w:type="dxa"/>
+          </w:tcPr>
+          <w:p>
+            <w:r>
+              <w:t>TIDAL job added/renamed/rescheduled, or new TIDAL export received</w:t>
+            </w:r>
+          </w:p>
+        </w:tc>
+        <w:tc>
+          <w:tcPr>
+            <w:tcW w:w="2340" w:type="dxa"/>
+          </w:tcPr>
+          <w:p>
+            <w:r>
+              <w:t>6, 7 (Combiner, Graph)</w:t>
+            </w:r>
+          </w:p>
+        </w:tc>
+        <w:tc>
+          <w:tcPr>
+            <w:tcW w:w="2340" w:type="dxa"/>
+          </w:tcPr>
+          <w:p>
+            <w:r>
+              <w:t>Weekly, or whenever a fresh TIDAL export is received</w:t>
+            </w:r>
+          </w:p>
+        </w:tc>
+        <w:tc>
+          <w:tcPr>
+            <w:tcW w:w="2340" w:type="dxa"/>
+          </w:tcPr>
+          <w:p>
+            <w:r>
+              <w:t>No PL/SQL re-parse needed — shell/Gudu/LLM outputs are unaffected.</w:t>
+            </w:r>
+          </w:p>
+        </w:tc>
+      </w:tr>
+      <w:tr>
+        <w:tc>
+          <w:tcPr>
+            <w:tcW w:w="2340" w:type="dxa"/>
+          </w:tcPr>
+          <w:p>
+            <w:r>
+              <w:t>DIFW_Query_Results.xlsx refreshed (re-run of DIFW_tidal_lineage_query.sql)</w:t>
+            </w:r>
+          </w:p>
+        </w:tc>
+        <w:tc>
+          <w:tcPr>
+            <w:tcW w:w="2340" w:type="dxa"/>
+          </w:tcPr>
+          <w:p>
+            <w:r>
+              <w:t>6, 7 (Combiner, Graph)</w:t>
+            </w:r>
+          </w:p>
+        </w:tc>
+        <w:tc>
+          <w:tcPr>
+            <w:tcW w:w="2340" w:type="dxa"/>
+          </w:tcPr>
+          <w:p>
+            <w:r>
+              <w:t>Monthly, or whenever DIFW-pattern (PKG_GRP_LOAD_DIFW*) packages change</w:t>
+            </w:r>
+          </w:p>
+        </w:tc>
+        <w:tc>
+          <w:tcPr>
+            <w:tcW w:w="2340" w:type="dxa"/>
+          </w:tcPr>
+          <w:p>
+            <w:r>
+              <w:t>See run_pipeline.py Prerequisite note — this step is manual, outside the runner.</w:t>
+            </w:r>
+          </w:p>
+        </w:tc>
+      </w:tr>
+      <w:tr>
+        <w:tc>
+          <w:tcPr>
+            <w:tcW w:w="2340" w:type="dxa"/>
+          </w:tcPr>
+          <w:p>
+            <w:r>
+              <w:t>Shell script (.sh) added or modified</w:t>
+            </w:r>
+          </w:p>
+        </w:tc>
+        <w:tc>
+          <w:tcPr>
+            <w:tcW w:w="2340" w:type="dxa"/>
+          </w:tcPr>
+          <w:p>
+            <w:r>
+              <w:t>1, 6, 7 (Shell Parser, Combiner, Graph)</w:t>
+            </w:r>
+          </w:p>
+        </w:tc>
+        <w:tc>
+          <w:tcPr>
+            <w:tcW w:w="2340" w:type="dxa"/>
+          </w:tcPr>
+          <w:p>
+            <w:r>
+              <w:t>On shell script deployment</w:t>
+            </w:r>
+          </w:p>
+        </w:tc>
+        <w:tc>
+          <w:tcPr>
+            <w:tcW w:w="2340" w:type="dxa"/>
+          </w:tcPr>
+          <w:p>
+            <w:r>
+              <w:t>Scope shell_parser.py to the changed script(s) where possible.</w:t>
+            </w:r>
+          </w:p>
+        </w:tc>
+      </w:tr>
+      <w:tr>
+        <w:tc>
+          <w:tcPr>
+            <w:tcW w:w="2340" w:type="dxa"/>
+          </w:tcPr>
+          <w:p>
+            <w:r>
+              <w:t>PL/SQL package/procedure added or modified</w:t>
+            </w:r>
+          </w:p>
+        </w:tc>
+        <w:tc>
+          <w:tcPr>
+            <w:tcW w:w="2340" w:type="dxa"/>
+          </w:tcPr>
+          <w:p>
+            <w:r>
+              <w:t>2, 3, 4, 6, 7 (Clean+Gudu, Extract Gudu, LLM, Combiner, Graph)</w:t>
+            </w:r>
+          </w:p>
+        </w:tc>
+        <w:tc>
+          <w:tcPr>
+            <w:tcW w:w="2340" w:type="dxa"/>
+          </w:tcPr>
+          <w:p>
+            <w:r>
+              <w:t>On every PL/SQL deployment/release</w:t>
+            </w:r>
+          </w:p>
+        </w:tc>
+        <w:tc>
+          <w:tcPr>
+            <w:tcW w:w="2340" w:type="dxa"/>
+          </w:tcPr>
+          <w:p>
+            <w:r>
+              <w:t>Run Stages 2-4 against an ISOLATED cleaned-dir for ONLY the changed file(s), then merge (append unique rows) into the master gudu_lineage_output.csv / llm_lineage_output.csv — do not repoint Stages 2-4 at the full All_Metadata directory (see Section 4.4).</w:t>
+            </w:r>
+          </w:p>
+        </w:tc>
+      </w:tr>
+      <w:tr>
+        <w:tc>
+          <w:tcPr>
+            <w:tcW w:w="2340" w:type="dxa"/>
+          </w:tcPr>
+          <w:p>
+            <w:r>
+              <w:t>New RPT table added to scope</w:t>
+            </w:r>
+          </w:p>
+        </w:tc>
+        <w:tc>
+          <w:tcPr>
+            <w:tcW w:w="2340" w:type="dxa"/>
+          </w:tcPr>
+          <w:p>
+            <w:r>
+              <w:t>1-7, then 5.1 add root job to RPT_ROOT_JOBS in tidal_shell_combiner.py</w:t>
+            </w:r>
+          </w:p>
+        </w:tc>
+        <w:tc>
+          <w:tcPr>
+            <w:tcW w:w="2340" w:type="dxa"/>
+          </w:tcPr>
+          <w:p>
+            <w:r>
+              <w:t>Ad hoc, on scope expansion</w:t>
+            </w:r>
+          </w:p>
+        </w:tc>
+        <w:tc>
+          <w:tcPr>
+            <w:tcW w:w="2340" w:type="dxa"/>
+          </w:tcPr>
+          <w:p>
+            <w:r>
+              <w:t xml:space="preserve">Follow the full onboarding sequence used for the Sept 2026 19-table expansion: add source PL/SQL to a new metadata folder, register it in config.py, add its root job to RPT_ROOT_JOBS, </w:t>
+            </w:r>
+            <w:r>
+              <w:lastRenderedPageBreak/>
+              <w:t>then run Stages 1-7.</w:t>
+            </w:r>
+          </w:p>
+        </w:tc>
+      </w:tr>
+      <w:tr>
+        <w:tc>
+          <w:tcPr>
+            <w:tcW w:w="2340" w:type="dxa"/>
+          </w:tcPr>
+          <w:p>
+            <w:r>
+              <w:lastRenderedPageBreak/>
+              <w:t>Hop-reduction review cycle</w:t>
+            </w:r>
+          </w:p>
+        </w:tc>
+        <w:tc>
+          <w:tcPr>
+            <w:tcW w:w="2340" w:type="dxa"/>
+          </w:tcPr>
+          <w:p>
+            <w:r>
+              <w:t>8, 9, 10 (Hop Reduction, Master Recs, Verified Savings)</w:t>
+            </w:r>
+          </w:p>
+        </w:tc>
+        <w:tc>
+          <w:tcPr>
+            <w:tcW w:w="2340" w:type="dxa"/>
+          </w:tcPr>
+          <w:p>
+            <w:r>
+              <w:t>Quarterly, or after a wave of consolidation work lands</w:t>
+            </w:r>
+          </w:p>
+        </w:tc>
+        <w:tc>
+          <w:tcPr>
+            <w:tcW w:w="2340" w:type="dxa"/>
+          </w:tcPr>
+          <w:p>
+            <w:r>
+              <w:t>Depends on a fresh Stage 6 combined lineage — rerun Stage 6 first if it is more than a few weeks old.</w:t>
+            </w:r>
+          </w:p>
+        </w:tc>
+      </w:tr>
+      <w:tr>
+        <w:tc>
+          <w:tcPr>
+            <w:tcW w:w="2340" w:type="dxa"/>
+          </w:tcPr>
+          <w:p>
+            <w:r>
+              <w:t>Full baseline resync / pre-release validation</w:t>
+            </w:r>
+          </w:p>
+        </w:tc>
+        <w:tc>
+          <w:tcPr>
+            <w:tcW w:w="2340" w:type="dxa"/>
+          </w:tcPr>
+          <w:p>
+            <w:r>
+              <w:t>1-10 (all stages)</w:t>
+            </w:r>
+          </w:p>
+        </w:tc>
+        <w:tc>
+          <w:tcPr>
+            <w:tcW w:w="2340" w:type="dxa"/>
+          </w:tcPr>
+          <w:p>
+            <w:r>
+              <w:t>Monthly, or before any major release</w:t>
+            </w:r>
+          </w:p>
+        </w:tc>
+        <w:tc>
+          <w:tcPr>
+            <w:tcW w:w="2340" w:type="dxa"/>
+          </w:tcPr>
+          <w:p>
+            <w:r>
+              <w:t>Compare before/after row counts and per-RPT completion % (printed by Stage 6) to catch regressions.</w:t>
+            </w:r>
+          </w:p>
+        </w:tc>
+      </w:tr>
+    </w:tbl>
+    <w:p>
+      <w:pPr>
+        <w:pStyle w:val="Heading2"/>
+      </w:pPr>
+      <w:r>
+        <w:t>4.2  Recommended Cadence Summary</w:t>
+      </w:r>
+    </w:p>
+    <w:p>
+      <w:pPr>
+        <w:pStyle w:val="ListBullet"/>
+      </w:pPr>
+      <w:r>
+        <w:t>Lightweight (weekly): Stage 6 (tidal_shell_combiner.py) only, using the latest TIDAL exports and DIFW_Query_Results.xlsx. Fast, no PL/SQL re-parsing, catches job/dependency/schedule drift.</w:t>
+      </w:r>
+    </w:p>
+    <w:p>
+      <w:pPr>
+        <w:pStyle w:val="ListBullet"/>
+      </w:pPr>
+      <w:r>
+        <w:t>Incremental (per release, on demand): Stages 2-4 scoped to only the changed PL/SQL/shell files, followed by Stage 6-7. This is the pattern established during the Sept 2026 expansion (isolated cleaned-dir + merge into master CSVs) and keeps LLM/Gudu cost proportional to the actual change size.</w:t>
+      </w:r>
+    </w:p>
+    <w:p>
+      <w:pPr>
+        <w:pStyle w:val="ListBullet"/>
+      </w:pPr>
+      <w:r>
+        <w:t>Full rebuild (monthly / quarterly): All 10 stages end-to-end against the complete All_Metadata + Lineage_Expansion_Metadata scope, to catch drift that incremental runs might miss (renamed files, orphaned objects) and to refresh the hop-reduction recommendations.</w:t>
+      </w:r>
+    </w:p>
+    <w:p>
+      <w:pPr>
+        <w:pStyle w:val="Heading2"/>
+      </w:pPr>
+      <w:r>
+        <w:t>4.3  Change Detection</w:t>
+      </w:r>
+    </w:p>
+    <w:p>
+      <w:r>
+        <w:t>Use git diff / file modification timestamps on All_Metadata/, Lineage_Expansion_Metadata/, and shell_scripts/ (relative to the last successful pipeline run) to identify exactly which PL/SQL or shell files changed, so Stages 2-4 can be scoped to only those files instead of a full reprocess.</w:t>
+      </w:r>
+    </w:p>
+    <w:p>
+      <w:pPr>
+        <w:pStyle w:val="Heading2"/>
+      </w:pPr>
+      <w:r>
+        <w:t>4.4  Guardrails to Avoid Regressions</w:t>
+      </w:r>
+    </w:p>
+    <w:p>
+      <w:pPr>
+        <w:pStyle w:val="ListBullet"/>
+      </w:pPr>
+      <w:r>
+        <w:t>Never point extract_gudu_lineage.py or llm_lineage_extractor.py's auto-detection directly at the full All_Metadata directory for an incremental run — extract_gudu_lineage.py always overwrites its output CSV, and llm_lineage_extractor.py rescans the entire cleaned-dir, risking duplicate LLM calls and lost history. Always clean+parse changed files into an isolated directory first, then merge unique rows into the master CSVs.</w:t>
+      </w:r>
+    </w:p>
+    <w:p>
+      <w:pPr>
+        <w:pStyle w:val="ListBullet"/>
+      </w:pPr>
+      <w:r>
+        <w:t>Keep RPT_ROOT_JOBS in tidal_shell_combiner.py in sync with the actual RPT scope — add new root job entries before running Stage 6 for a newly onboarded table.</w:t>
+      </w:r>
+    </w:p>
+    <w:p>
+      <w:pPr>
+        <w:pStyle w:val="ListBullet"/>
+      </w:pPr>
+      <w:r>
+        <w:t>Rerun generate_pkg_proc_analysis.py (Stage 5) whenever a new source metadata directory is added, so PKG_PROC_Analysis_All_Metadata.xlsx reflects every package.</w:t>
+      </w:r>
+    </w:p>
+    <w:p>
+      <w:pPr>
+        <w:pStyle w:val="ListBullet"/>
+      </w:pPr>
+      <w:r>
+        <w:t>Back up combined_lineage_latest_expanded.csv, gudu_lineage_output.csv, and llm_lineage_output.csv before a full rebuild, and compare Stage 6's printed completion % per RPT table before/after to catch coverage regressions early.</w:t>
+      </w:r>
     </w:p>
     <w:sectPr>
       <w:pgSz w:w="12240" w:h="15840"/>

</xml_diff>

<commit_message>
Add Mode A/B actual-transformation extraction, wire into combiner, fix Hybrid-MAIN append bug, ignore *.zip
</commit_message>
<xml_diff>
--- a/docs/RSLI_DataLineage_and_HopReduction_Solution_Flow.docx
+++ b/docs/RSLI_DataLineage_and_HopReduction_Solution_Flow.docx
@@ -431,8 +431,8 @@
         <w:tblLook w:val="04A0" w:firstRow="1" w:lastRow="0" w:firstColumn="1" w:lastColumn="0" w:noHBand="0" w:noVBand="1"/>
       </w:tblPr>
       <w:tblGrid>
-        <w:gridCol w:w="3000"/>
-        <w:gridCol w:w="2452"/>
+        <w:gridCol w:w="2991"/>
+        <w:gridCol w:w="2461"/>
         <w:gridCol w:w="4124"/>
       </w:tblGrid>
       <w:tr>
@@ -835,6 +835,62 @@
       <w:tr>
         <w:tc>
           <w:tcPr>
+            <w:tcW w:w="3000" w:type="dxa"/>
+          </w:tcPr>
+          <w:p>
+            <w:pPr>
+              <w:rPr>
+                <w:sz w:val="17"/>
+              </w:rPr>
+            </w:pPr>
+            <w:r>
+              <w:rPr>
+                <w:sz w:val="17"/>
+              </w:rPr>
+              <w:t>extract_gudu_lineage.py</w:t>
+            </w:r>
+          </w:p>
+        </w:tc>
+        <w:tc>
+          <w:tcPr>
+            <w:tcW w:w="2452" w:type="dxa"/>
+          </w:tcPr>
+          <w:p>
+            <w:pPr>
+              <w:rPr>
+                <w:sz w:val="17"/>
+              </w:rPr>
+            </w:pPr>
+            <w:r>
+              <w:rPr>
+                <w:sz w:val="17"/>
+              </w:rPr>
+              <w:t>Gudu Lineage Extraction (Structural)</w:t>
+            </w:r>
+          </w:p>
+        </w:tc>
+        <w:tc>
+          <w:tcPr>
+            <w:tcW w:w="4124" w:type="dxa"/>
+          </w:tcPr>
+          <w:p>
+            <w:pPr>
+              <w:rPr>
+                <w:sz w:val="17"/>
+              </w:rPr>
+            </w:pPr>
+            <w:r>
+              <w:rPr>
+                <w:sz w:val="17"/>
+              </w:rPr>
+              <w:t>Parses Gudu SQLFlow JSON into gudu_lineage_output.csv — target/source table and column resolution only, no LLM calls (reverted to a pure structural parser, Oct 2026). Exact SQL expression detail (Actual Transformation) is supplied separately by llm_lineage_extractor.py and merged in by tidal_shell_combiner.py.</w:t>
+            </w:r>
+          </w:p>
+        </w:tc>
+      </w:tr>
+      <w:tr>
+        <w:tc>
+          <w:tcPr>
             <w:tcW w:w="3158" w:type="dxa"/>
             <w:shd w:val="clear" w:color="auto" w:fill="EEF2FA"/>
           </w:tcPr>
@@ -898,87 +954,8 @@
             <w:r>
               <w:rPr>
                 <w:sz w:val="17"/>
-                <w:szCs w:val="17"/>
-              </w:rPr>
-              <w:t>LLM-based SQL lineage extractor — fallback for files Python (</w:t>
-            </w:r>
-            <w:proofErr w:type="spellStart"/>
-            <w:r>
-              <w:rPr>
-                <w:sz w:val="17"/>
-                <w:szCs w:val="17"/>
-              </w:rPr>
-              <w:t>Gudu</w:t>
-            </w:r>
-            <w:proofErr w:type="spellEnd"/>
-            <w:r>
-              <w:rPr>
-                <w:sz w:val="17"/>
-                <w:szCs w:val="17"/>
-              </w:rPr>
-              <w:t xml:space="preserve">+ </w:t>
-            </w:r>
-            <w:proofErr w:type="spellStart"/>
-            <w:r>
-              <w:rPr>
-                <w:sz w:val="17"/>
-                <w:szCs w:val="17"/>
-              </w:rPr>
-              <w:t>SQLGlot</w:t>
-            </w:r>
-            <w:proofErr w:type="spellEnd"/>
-            <w:r>
-              <w:rPr>
-                <w:sz w:val="17"/>
-                <w:szCs w:val="17"/>
-              </w:rPr>
-              <w:t>) couldn't process.</w:t>
-            </w:r>
-            <w:r>
-              <w:rPr>
-                <w:sz w:val="17"/>
-                <w:szCs w:val="17"/>
-              </w:rPr>
-              <w:t xml:space="preserve"> </w:t>
-            </w:r>
-          </w:p>
-          <w:p>
-            <w:pPr>
-              <w:rPr>
-                <w:sz w:val="17"/>
-                <w:szCs w:val="17"/>
-              </w:rPr>
-            </w:pPr>
-            <w:r>
-              <w:rPr>
-                <w:sz w:val="17"/>
-                <w:szCs w:val="17"/>
-              </w:rPr>
-              <w:object w:dxaOrig="1860" w:dyaOrig="830" w14:anchorId="6FDE81BB">
-                <v:shapetype id="_x0000_t75" coordsize="21600,21600" o:spt="75" o:preferrelative="t" path="m@4@5l@4@11@9@11@9@5xe" filled="f" stroked="f">
-                  <v:stroke joinstyle="miter"/>
-                  <v:formulas>
-                    <v:f eqn="if lineDrawn pixelLineWidth 0"/>
-                    <v:f eqn="sum @0 1 0"/>
-                    <v:f eqn="sum 0 0 @1"/>
-                    <v:f eqn="prod @2 1 2"/>
-                    <v:f eqn="prod @3 21600 pixelWidth"/>
-                    <v:f eqn="prod @3 21600 pixelHeight"/>
-                    <v:f eqn="sum @0 0 1"/>
-                    <v:f eqn="prod @6 1 2"/>
-                    <v:f eqn="prod @7 21600 pixelWidth"/>
-                    <v:f eqn="sum @8 21600 0"/>
-                    <v:f eqn="prod @7 21600 pixelHeight"/>
-                    <v:f eqn="sum @10 21600 0"/>
-                  </v:formulas>
-                  <v:path o:extrusionok="f" gradientshapeok="t" o:connecttype="rect"/>
-                  <o:lock v:ext="edit" aspectratio="t"/>
-                </v:shapetype>
-                <v:shape id="_x0000_i1025" type="#_x0000_t75" style="width:93pt;height:41.25pt" o:ole="">
-                  <v:imagedata r:id="rId7" o:title=""/>
-                </v:shape>
-                <o:OLEObject Type="Embed" ProgID="Package" ShapeID="_x0000_i1025" DrawAspect="Icon" ObjectID="_1851228847" r:id="rId8"/>
-              </w:object>
+              </w:rPr>
+              <w:t>LLM-based SQL lineage extractor, now run in two modes (Oct 2026): Mode A (discovery, default) — full lineage plus the exact SQL expression (Actual Transformation) for objects Gudu couldn't resolve; Mode B (--enrich-gudu) — adds only Actual Transformation onto objects Gudu already resolved structurally, keyed by target column so every source row sharing one target column gets identical wording. Together the two modes cover every SQL object across both metadata domains.</w:t>
             </w:r>
           </w:p>
         </w:tc>
@@ -1033,7 +1010,7 @@
               <w:rPr>
                 <w:sz w:val="17"/>
               </w:rPr>
-              <w:t>Joins five data sources to build a unified column-level lineage map across 10 RPT tables</w:t>
+              <w:t>Joins five data sources to build a unified column-level lineage map across 10 RPT tables. Also backfills Actual Transformation from llm_lineage_output.csv onto Gudu's structural rows (keyed by target column) and surfaces it as a new ACTUAL_TRANSFORMATION column in column_level_normalized.csv and attribute_main.xlsx (Oct 2026).</w:t>
             </w:r>
           </w:p>
         </w:tc>
@@ -1182,101 +1159,11 @@
         </w:rPr>
       </w:pPr>
       <w:r>
-        <w:rPr>
-          <w:b/>
-        </w:rPr>
-        <w:t>Note:</w:t>
+        <w:t xml:space="preserve">Note: llm_lineage_extractor.py (Oct 2026 update) uses an LLM prompt that parses Oracle PL/SQL code to extract column-level lineage, resolve source-to-target mappings, and capture the exact SQL expression (Actual Transformation) behind each target column — not just a transformation </w:t>
       </w:r>
       <w:r>
-        <w:rPr>
-          <w:sz w:val="17"/>
-          <w:szCs w:val="17"/>
-        </w:rPr>
-        <w:t xml:space="preserve"> </w:t>
-      </w:r>
-      <w:r>
-        <w:rPr>
-          <w:sz w:val="19"/>
-          <w:szCs w:val="19"/>
-        </w:rPr>
-        <w:t>l</w:t>
-      </w:r>
-      <w:r>
-        <w:rPr>
-          <w:sz w:val="19"/>
-          <w:szCs w:val="19"/>
-        </w:rPr>
-        <w:t>m</w:t>
-      </w:r>
-      <w:r>
-        <w:rPr>
-          <w:sz w:val="19"/>
-          <w:szCs w:val="19"/>
-        </w:rPr>
-        <w:t xml:space="preserve">_lineage_extractor.py script uses an LLM prompt that </w:t>
-      </w:r>
-      <w:r>
-        <w:rPr>
-          <w:sz w:val="19"/>
-          <w:szCs w:val="19"/>
-        </w:rPr>
-        <w:t>parses</w:t>
-      </w:r>
-      <w:r>
-        <w:rPr>
-          <w:sz w:val="19"/>
-          <w:szCs w:val="19"/>
-        </w:rPr>
-        <w:t xml:space="preserve"> Oracle PL/SQL code </w:t>
-      </w:r>
-      <w:r>
-        <w:rPr>
-          <w:sz w:val="19"/>
-          <w:szCs w:val="19"/>
-        </w:rPr>
-        <w:t>to extract</w:t>
-      </w:r>
-      <w:r>
-        <w:rPr>
-          <w:sz w:val="19"/>
-          <w:szCs w:val="19"/>
-        </w:rPr>
-        <w:t xml:space="preserve"> column-level lineage</w:t>
-      </w:r>
-      <w:r>
-        <w:rPr>
-          <w:sz w:val="19"/>
-          <w:szCs w:val="19"/>
-        </w:rPr>
-        <w:t>, resolve</w:t>
-      </w:r>
-      <w:r>
-        <w:rPr>
-          <w:sz w:val="19"/>
-          <w:szCs w:val="19"/>
-        </w:rPr>
-        <w:t xml:space="preserve"> source-to-target mappings, </w:t>
-      </w:r>
-      <w:r>
-        <w:rPr>
-          <w:sz w:val="19"/>
-          <w:szCs w:val="19"/>
-        </w:rPr>
-        <w:t>and identify</w:t>
-      </w:r>
-      <w:r>
-        <w:rPr>
-          <w:sz w:val="19"/>
-          <w:szCs w:val="19"/>
-        </w:rPr>
-        <w:t xml:space="preserve"> transformations</w:t>
-      </w:r>
-      <w:r>
-        <w:rPr>
-          <w:sz w:val="19"/>
-          <w:szCs w:val="19"/>
-        </w:rPr>
-        <w:t xml:space="preserve"> across DML, CTAS, and dynamic SQL statements. The output is generated as structured JSON for lineage analysis and visualization.</w:t>
+        <w:lastRenderedPageBreak/>
+        <w:t>category — across DML, CTAS, and dynamic SQL statements. extract_gudu_lineage.py remains a fast, free, deterministic structural parser (no LLM) for the common case; the two outputs are merged by tidal_shell_combiner.py.</w:t>
       </w:r>
     </w:p>
     <w:p>
@@ -2532,7 +2419,7 @@
                           <pic:cNvPicPr/>
                         </pic:nvPicPr>
                         <pic:blipFill>
-                          <a:blip r:embed="rId9"/>
+                          <a:blip r:embed="rId7"/>
                           <a:stretch>
                             <a:fillRect/>
                           </a:stretch>
@@ -2859,10 +2746,29 @@
                 <w:szCs w:val="17"/>
               </w:rPr>
               <w:object w:dxaOrig="2310" w:dyaOrig="830" w14:anchorId="56821B3F">
-                <v:shape id="_x0000_i1026" type="#_x0000_t75" style="width:81.75pt;height:37.5pt" o:ole="">
-                  <v:imagedata r:id="rId10" o:title=""/>
+                <v:shapetype id="_x0000_t75" coordsize="21600,21600" o:spt="75" o:preferrelative="t" path="m@4@5l@4@11@9@11@9@5xe" filled="f" stroked="f">
+                  <v:stroke joinstyle="miter"/>
+                  <v:formulas>
+                    <v:f eqn="if lineDrawn pixelLineWidth 0"/>
+                    <v:f eqn="sum @0 1 0"/>
+                    <v:f eqn="sum 0 0 @1"/>
+                    <v:f eqn="prod @2 1 2"/>
+                    <v:f eqn="prod @3 21600 pixelWidth"/>
+                    <v:f eqn="prod @3 21600 pixelHeight"/>
+                    <v:f eqn="sum @0 0 1"/>
+                    <v:f eqn="prod @6 1 2"/>
+                    <v:f eqn="prod @7 21600 pixelWidth"/>
+                    <v:f eqn="sum @8 21600 0"/>
+                    <v:f eqn="prod @7 21600 pixelHeight"/>
+                    <v:f eqn="sum @10 21600 0"/>
+                  </v:formulas>
+                  <v:path o:extrusionok="f" gradientshapeok="t" o:connecttype="rect"/>
+                  <o:lock v:ext="edit" aspectratio="t"/>
+                </v:shapetype>
+                <v:shape id="_x0000_i1025" type="#_x0000_t75" style="width:82pt;height:37.5pt" o:ole="">
+                  <v:imagedata r:id="rId8" o:title=""/>
                 </v:shape>
-                <o:OLEObject Type="Embed" ProgID="Package" ShapeID="_x0000_i1026" DrawAspect="Content" ObjectID="_1851228848" r:id="rId11"/>
+                <o:OLEObject Type="Embed" ProgID="Package" ShapeID="_x0000_i1025" DrawAspect="Content" ObjectID="_1853532466" r:id="rId9"/>
               </w:object>
             </w:r>
           </w:p>
@@ -4966,6 +4872,26 @@
       </w:pPr>
       <w:r>
         <w:t>Never point extract_gudu_lineage.py or llm_lineage_extractor.py's auto-detection directly at the full All_Metadata directory for an incremental run — extract_gudu_lineage.py always overwrites its output CSV, and llm_lineage_extractor.py rescans the entire cleaned-dir, risking duplicate LLM calls and lost history. Always clean+parse changed files into an isolated directory first, then merge unique rows into the master CSVs.</w:t>
+      </w:r>
+    </w:p>
+    <w:p>
+      <w:pPr>
+        <w:pStyle w:val="ListBullet"/>
+      </w:pPr>
+      <w:r>
+        <w:t>llm_lineage_extractor.py's auto mode only treats an object as “already processed” (skipping re-detection of Hybrid MAIN procedures) when --append is passed. A non-append run always overwrites its output file at the end, so honouring stale “already done” state without --append silently drops those objects from the final CSV. Fixed Oct 2026 — verify this invariant if the skip logic is ever touched again.</w:t>
+      </w:r>
+    </w:p>
+    <w:p>
+      <w:pPr>
+        <w:pStyle w:val="ListBullet"/>
+      </w:pPr>
+      <w:r>
+        <w:t xml:space="preserve">Always run tidal_shell_combiner.py via run_pipeline.py --stages 6 (or pass every flag it expects, especially --pkg-proc-analysis) rather than invoking it directly — omitting --pkg-proc-analysis </w:t>
+      </w:r>
+      <w:r>
+        <w:lastRenderedPageBreak/>
+        <w:t>silently disables PKG.main orchestrator expansion and drops those packages from attribute_main.xlsx / column_level_normalized.csv with no error.</w:t>
       </w:r>
     </w:p>
     <w:p>

</xml_diff>